<commit_message>
Se avanza pantalla inicial
</commit_message>
<xml_diff>
--- a/Colores/Colores base.docx
+++ b/Colores/Colores base.docx
@@ -59,6 +59,9 @@
     </w:p>
     <w:p>
       <w:r>
+        <w:rPr>
+          <w:noProof/>
+        </w:rPr>
         <w:drawing>
           <wp:anchor distT="0" distB="0" distL="114300" distR="114300" simplePos="0" relativeHeight="251659264" behindDoc="1" locked="0" layoutInCell="1" allowOverlap="1" wp14:anchorId="142F7D6E" wp14:editId="6D2205B1">
             <wp:simplePos x="0" y="0"/>
@@ -110,6 +113,9 @@
         </w:drawing>
       </w:r>
       <w:r>
+        <w:rPr>
+          <w:noProof/>
+        </w:rPr>
         <w:drawing>
           <wp:anchor distT="0" distB="0" distL="114300" distR="114300" simplePos="0" relativeHeight="251658240" behindDoc="1" locked="0" layoutInCell="1" allowOverlap="1" wp14:anchorId="65F4EE90" wp14:editId="13B4001A">
             <wp:simplePos x="0" y="0"/>
@@ -161,6 +167,9 @@
         </w:drawing>
       </w:r>
       <w:r>
+        <w:rPr>
+          <w:noProof/>
+        </w:rPr>
         <w:drawing>
           <wp:inline distT="0" distB="0" distL="0" distR="0" wp14:anchorId="4CCAD9D2" wp14:editId="7C6A37E1">
             <wp:extent cx="3209925" cy="1482028"/>
@@ -198,6 +207,9 @@
         </w:drawing>
       </w:r>
       <w:r>
+        <w:rPr>
+          <w:noProof/>
+        </w:rPr>
         <w:drawing>
           <wp:inline distT="0" distB="0" distL="0" distR="0" wp14:anchorId="541314B0" wp14:editId="61956341">
             <wp:extent cx="3200400" cy="1444907"/>
@@ -237,6 +249,9 @@
     </w:p>
     <w:p>
       <w:r>
+        <w:rPr>
+          <w:noProof/>
+        </w:rPr>
         <w:drawing>
           <wp:anchor distT="0" distB="0" distL="114300" distR="114300" simplePos="0" relativeHeight="251661312" behindDoc="1" locked="0" layoutInCell="1" allowOverlap="1" wp14:anchorId="0E296527" wp14:editId="7E12197B">
             <wp:simplePos x="0" y="0"/>
@@ -293,68 +308,14 @@
           </wp:anchor>
         </w:drawing>
       </w:r>
-      <w:r>
-        <w:drawing>
-          <wp:anchor distT="0" distB="0" distL="114300" distR="114300" simplePos="0" relativeHeight="251660288" behindDoc="1" locked="0" layoutInCell="1" allowOverlap="1" wp14:anchorId="0E395BD4" wp14:editId="0D07233E">
-            <wp:simplePos x="0" y="0"/>
-            <wp:positionH relativeFrom="margin">
-              <wp:posOffset>24765</wp:posOffset>
-            </wp:positionH>
-            <wp:positionV relativeFrom="paragraph">
-              <wp:posOffset>8889</wp:posOffset>
-            </wp:positionV>
-            <wp:extent cx="3098536" cy="1400175"/>
-            <wp:effectExtent l="0" t="0" r="6985" b="0"/>
-            <wp:wrapNone/>
-            <wp:docPr id="1460912070" name="Imagen 1" descr="Interfaz de usuario gráfica, Texto, Aplicación, Chat o mensaje de texto&#10;&#10;Descripción generada automáticamente"/>
-            <wp:cNvGraphicFramePr>
-              <a:graphicFrameLocks xmlns:a="http://schemas.openxmlformats.org/drawingml/2006/main" noChangeAspect="1"/>
-            </wp:cNvGraphicFramePr>
-            <a:graphic xmlns:a="http://schemas.openxmlformats.org/drawingml/2006/main">
-              <a:graphicData uri="http://schemas.openxmlformats.org/drawingml/2006/picture">
-                <pic:pic xmlns:pic="http://schemas.openxmlformats.org/drawingml/2006/picture">
-                  <pic:nvPicPr>
-                    <pic:cNvPr id="1460912070" name="Imagen 1" descr="Interfaz de usuario gráfica, Texto, Aplicación, Chat o mensaje de texto&#10;&#10;Descripción generada automáticamente"/>
-                    <pic:cNvPicPr/>
-                  </pic:nvPicPr>
-                  <pic:blipFill>
-                    <a:blip r:embed="rId10">
-                      <a:extLst>
-                        <a:ext uri="{28A0092B-C50C-407E-A947-70E740481C1C}">
-                          <a14:useLocalDpi xmlns:a14="http://schemas.microsoft.com/office/drawing/2010/main" val="0"/>
-                        </a:ext>
-                      </a:extLst>
-                    </a:blip>
-                    <a:stretch>
-                      <a:fillRect/>
-                    </a:stretch>
-                  </pic:blipFill>
-                  <pic:spPr>
-                    <a:xfrm>
-                      <a:off x="0" y="0"/>
-                      <a:ext cx="3104449" cy="1402847"/>
-                    </a:xfrm>
-                    <a:prstGeom prst="rect">
-                      <a:avLst/>
-                    </a:prstGeom>
-                  </pic:spPr>
-                </pic:pic>
-              </a:graphicData>
-            </a:graphic>
-            <wp14:sizeRelH relativeFrom="margin">
-              <wp14:pctWidth>0</wp14:pctWidth>
-            </wp14:sizeRelH>
-            <wp14:sizeRelV relativeFrom="margin">
-              <wp14:pctHeight>0</wp14:pctHeight>
-            </wp14:sizeRelV>
-          </wp:anchor>
-        </w:drawing>
-      </w:r>
     </w:p>
     <w:p/>
     <w:p/>
     <w:p>
       <w:r>
+        <w:rPr>
+          <w:noProof/>
+        </w:rPr>
         <w:lastRenderedPageBreak/>
         <w:drawing>
           <wp:anchor distT="0" distB="0" distL="114300" distR="114300" simplePos="0" relativeHeight="251662336" behindDoc="1" locked="0" layoutInCell="1" allowOverlap="1" wp14:anchorId="26B1C0CE" wp14:editId="10BB937A">
@@ -380,7 +341,7 @@
                     <pic:cNvPicPr/>
                   </pic:nvPicPr>
                   <pic:blipFill>
-                    <a:blip r:embed="rId11">
+                    <a:blip r:embed="rId10">
                       <a:extLst>
                         <a:ext uri="{28A0092B-C50C-407E-A947-70E740481C1C}">
                           <a14:useLocalDpi xmlns:a14="http://schemas.microsoft.com/office/drawing/2010/main" val="0"/>

</xml_diff>